<commit_message>
Add formal PRISMA-ScR checklist as Appendix E
The third pre-submission review recommended using the official
PRISMA-ScR checklist (Tricco et al. 2018; 20 required + 2 optional
items) to audit reporting completeness -- addressed in round 4's other
fixes but the checklist itself, as a explicit mapping of every item to
a manuscript section, had not yet been added. Adds it as Appendix E,
referencing the existing funding/conflict-of-interest/data-availability
statements and the deliberate non-assessment of risk of bias (items 12
and 16, marked optional for scoping reviews).

Co-Authored-By: Claude Sonnet 5 <noreply@anthropic.com>
Claude-Session: https://claude.ai/code/session_01WHdoH2brsuf2zg1uU5YHyB
</commit_message>
<xml_diff>
--- a/paper/burnout_scoping_review_paper.docx
+++ b/paper/burnout_scoping_review_paper.docx
@@ -12039,6 +12039,1581 @@
           <w:rtl/>
         </w:rPr>
         <w:t xml:space="preserve">Better Together: A Novel Online Physician Group Coaching Program to Reduce Burnout in Trainees: A Longitudinal Analysis.</w:t>
+      </w:r>
+    </w:p>
+    <w:p>
+      <w:r>
+        <w:br w:type="page"/>
+      </w:r>
+    </w:p>
+    <w:p>
+      <w:pPr>
+        <w:pStyle w:val="Heading1"/>
+        <w:bidi/>
+        <w:spacing w:after="200" w:before="400"/>
+        <w:jc w:val="right"/>
+      </w:pPr>
+      <w:r>
+        <w:rPr>
+          <w:rFonts w:ascii="Tahoma" w:cs="Tahoma" w:eastAsia="Tahoma" w:hAnsi="Tahoma"/>
+          <w:b/>
+          <w:bCs/>
+          <w:color w:val="0b0b0b"/>
+          <w:sz w:val="30"/>
+          <w:szCs w:val="30"/>
+          <w:rtl/>
+        </w:rPr>
+        <w:t xml:space="preserve">پیوست ه: چک‌لیست PRISMA-ScR</w:t>
+      </w:r>
+    </w:p>
+    <w:p>
+      <w:pPr>
+        <w:bidi/>
+        <w:spacing w:after="160" w:line="300"/>
+        <w:jc w:val="right"/>
+      </w:pPr>
+      <w:r>
+        <w:rPr>
+          <w:rFonts w:ascii="Tahoma" w:cs="Tahoma" w:eastAsia="Tahoma" w:hAnsi="Tahoma"/>
+          <w:rtl/>
+        </w:rPr>
+        <w:t xml:space="preserve">این پیوست انطباق گزارش‌دهی این مقاله را با چک‌لیست رسمی PRISMA-ScR (Tricco و همکاران، ۲۰۱۸؛ ۲۰ مورد ضروری + ۲ مورد اختیاری، شماره‌های ۱۲ و ۱۶) نشان می‌دهد. این چک‌لیست ابزار امتیازدهی کیفیت مطالعه نیست؛ فقط کامل‌بودن گزارش‌دهی را ردیابی می‌کند.</w:t>
+      </w:r>
+    </w:p>
+    <w:tbl>
+      <w:tblPr>
+        <w:tblW w:type="dxa" w:w="9350"/>
+        <w:tblBorders>
+          <w:top w:val="single" w:color="auto" w:sz="4"/>
+          <w:left w:val="single" w:color="auto" w:sz="4"/>
+          <w:bottom w:val="single" w:color="auto" w:sz="4"/>
+          <w:right w:val="single" w:color="auto" w:sz="4"/>
+          <w:insideH w:val="single" w:color="auto" w:sz="4"/>
+          <w:insideV w:val="single" w:color="auto" w:sz="4"/>
+        </w:tblBorders>
+      </w:tblPr>
+      <w:tblGrid>
+        <w:gridCol w:w="748"/>
+        <w:gridCol w:w="4862"/>
+        <w:gridCol w:w="3740"/>
+      </w:tblGrid>
+      <w:tr>
+        <w:tc>
+          <w:tcPr>
+            <w:tcW w:type="dxa" w:w="748"/>
+            <w:shd w:fill="1c5cab" w:val="clear"/>
+          </w:tcPr>
+          <w:p>
+            <w:pPr>
+              <w:bidi/>
+              <w:jc w:val="center"/>
+            </w:pPr>
+            <w:r>
+              <w:rPr>
+                <w:rFonts w:ascii="Tahoma" w:cs="Tahoma" w:eastAsia="Tahoma" w:hAnsi="Tahoma"/>
+                <w:b/>
+                <w:bCs/>
+                <w:color w:val="ffffff"/>
+                <w:sz w:val="19"/>
+                <w:szCs w:val="19"/>
+                <w:rtl/>
+              </w:rPr>
+              <w:t xml:space="preserve">#</w:t>
+            </w:r>
+          </w:p>
+        </w:tc>
+        <w:tc>
+          <w:tcPr>
+            <w:tcW w:type="dxa" w:w="4862"/>
+            <w:shd w:fill="1c5cab" w:val="clear"/>
+          </w:tcPr>
+          <w:p>
+            <w:pPr>
+              <w:bidi/>
+              <w:jc w:val="center"/>
+            </w:pPr>
+            <w:r>
+              <w:rPr>
+                <w:rFonts w:ascii="Tahoma" w:cs="Tahoma" w:eastAsia="Tahoma" w:hAnsi="Tahoma"/>
+                <w:b/>
+                <w:bCs/>
+                <w:color w:val="ffffff"/>
+                <w:sz w:val="19"/>
+                <w:szCs w:val="19"/>
+                <w:rtl/>
+              </w:rPr>
+              <w:t xml:space="preserve">مورد PRISMA-ScR</w:t>
+            </w:r>
+          </w:p>
+        </w:tc>
+        <w:tc>
+          <w:tcPr>
+            <w:tcW w:type="dxa" w:w="3740"/>
+            <w:shd w:fill="1c5cab" w:val="clear"/>
+          </w:tcPr>
+          <w:p>
+            <w:pPr>
+              <w:bidi/>
+              <w:jc w:val="center"/>
+            </w:pPr>
+            <w:r>
+              <w:rPr>
+                <w:rFonts w:ascii="Tahoma" w:cs="Tahoma" w:eastAsia="Tahoma" w:hAnsi="Tahoma"/>
+                <w:b/>
+                <w:bCs/>
+                <w:color w:val="ffffff"/>
+                <w:sz w:val="19"/>
+                <w:szCs w:val="19"/>
+                <w:rtl/>
+              </w:rPr>
+              <w:t xml:space="preserve">محل در این مقاله</w:t>
+            </w:r>
+          </w:p>
+        </w:tc>
+      </w:tr>
+      <w:tr>
+        <w:tc>
+          <w:tcPr>
+            <w:tcW w:type="dxa" w:w="748"/>
+            <w:shd w:fill="f9f9f7" w:val="clear"/>
+          </w:tcPr>
+          <w:p>
+            <w:pPr>
+              <w:bidi/>
+              <w:jc w:val="right"/>
+            </w:pPr>
+            <w:r>
+              <w:rPr>
+                <w:rFonts w:ascii="Tahoma" w:cs="Tahoma" w:eastAsia="Tahoma" w:hAnsi="Tahoma"/>
+                <w:sz w:val="18"/>
+                <w:szCs w:val="18"/>
+                <w:rtl/>
+              </w:rPr>
+              <w:t xml:space="preserve">۱</w:t>
+            </w:r>
+          </w:p>
+        </w:tc>
+        <w:tc>
+          <w:tcPr>
+            <w:tcW w:type="dxa" w:w="4862"/>
+            <w:shd w:fill="f9f9f7" w:val="clear"/>
+          </w:tcPr>
+          <w:p>
+            <w:pPr>
+              <w:bidi/>
+              <w:jc w:val="center"/>
+            </w:pPr>
+            <w:r>
+              <w:rPr>
+                <w:rFonts w:ascii="Tahoma" w:cs="Tahoma" w:eastAsia="Tahoma" w:hAnsi="Tahoma"/>
+                <w:sz w:val="18"/>
+                <w:szCs w:val="18"/>
+                <w:rtl/>
+              </w:rPr>
+              <w:t xml:space="preserve">Title — identify the report as a scoping review</w:t>
+            </w:r>
+          </w:p>
+        </w:tc>
+        <w:tc>
+          <w:tcPr>
+            <w:tcW w:type="dxa" w:w="3740"/>
+            <w:shd w:fill="f9f9f7" w:val="clear"/>
+          </w:tcPr>
+          <w:p>
+            <w:pPr>
+              <w:bidi/>
+              <w:jc w:val="center"/>
+            </w:pPr>
+            <w:r>
+              <w:rPr>
+                <w:rFonts w:ascii="Tahoma" w:cs="Tahoma" w:eastAsia="Tahoma" w:hAnsi="Tahoma"/>
+                <w:sz w:val="18"/>
+                <w:szCs w:val="18"/>
+                <w:rtl/>
+              </w:rPr>
+              <w:t xml:space="preserve">صفحه عنوان</w:t>
+            </w:r>
+          </w:p>
+        </w:tc>
+      </w:tr>
+      <w:tr>
+        <w:tc>
+          <w:tcPr>
+            <w:tcW w:type="dxa" w:w="748"/>
+            <w:shd w:fill="ffffff" w:val="clear"/>
+          </w:tcPr>
+          <w:p>
+            <w:pPr>
+              <w:bidi/>
+              <w:jc w:val="right"/>
+            </w:pPr>
+            <w:r>
+              <w:rPr>
+                <w:rFonts w:ascii="Tahoma" w:cs="Tahoma" w:eastAsia="Tahoma" w:hAnsi="Tahoma"/>
+                <w:sz w:val="18"/>
+                <w:szCs w:val="18"/>
+                <w:rtl/>
+              </w:rPr>
+              <w:t xml:space="preserve">۲</w:t>
+            </w:r>
+          </w:p>
+        </w:tc>
+        <w:tc>
+          <w:tcPr>
+            <w:tcW w:type="dxa" w:w="4862"/>
+            <w:shd w:fill="ffffff" w:val="clear"/>
+          </w:tcPr>
+          <w:p>
+            <w:pPr>
+              <w:bidi/>
+              <w:jc w:val="center"/>
+            </w:pPr>
+            <w:r>
+              <w:rPr>
+                <w:rFonts w:ascii="Tahoma" w:cs="Tahoma" w:eastAsia="Tahoma" w:hAnsi="Tahoma"/>
+                <w:sz w:val="18"/>
+                <w:szCs w:val="18"/>
+                <w:rtl/>
+              </w:rPr>
+              <w:t xml:space="preserve">Structured summary</w:t>
+            </w:r>
+          </w:p>
+        </w:tc>
+        <w:tc>
+          <w:tcPr>
+            <w:tcW w:type="dxa" w:w="3740"/>
+            <w:shd w:fill="ffffff" w:val="clear"/>
+          </w:tcPr>
+          <w:p>
+            <w:pPr>
+              <w:bidi/>
+              <w:jc w:val="center"/>
+            </w:pPr>
+            <w:r>
+              <w:rPr>
+                <w:rFonts w:ascii="Tahoma" w:cs="Tahoma" w:eastAsia="Tahoma" w:hAnsi="Tahoma"/>
+                <w:sz w:val="18"/>
+                <w:szCs w:val="18"/>
+                <w:rtl/>
+              </w:rPr>
+              <w:t xml:space="preserve">چکیده فارسی و انگلیسی (بخش‌بندی‌شده)</w:t>
+            </w:r>
+          </w:p>
+        </w:tc>
+      </w:tr>
+      <w:tr>
+        <w:tc>
+          <w:tcPr>
+            <w:tcW w:type="dxa" w:w="748"/>
+            <w:shd w:fill="f9f9f7" w:val="clear"/>
+          </w:tcPr>
+          <w:p>
+            <w:pPr>
+              <w:bidi/>
+              <w:jc w:val="right"/>
+            </w:pPr>
+            <w:r>
+              <w:rPr>
+                <w:rFonts w:ascii="Tahoma" w:cs="Tahoma" w:eastAsia="Tahoma" w:hAnsi="Tahoma"/>
+                <w:sz w:val="18"/>
+                <w:szCs w:val="18"/>
+                <w:rtl/>
+              </w:rPr>
+              <w:t xml:space="preserve">۳</w:t>
+            </w:r>
+          </w:p>
+        </w:tc>
+        <w:tc>
+          <w:tcPr>
+            <w:tcW w:type="dxa" w:w="4862"/>
+            <w:shd w:fill="f9f9f7" w:val="clear"/>
+          </w:tcPr>
+          <w:p>
+            <w:pPr>
+              <w:bidi/>
+              <w:jc w:val="center"/>
+            </w:pPr>
+            <w:r>
+              <w:rPr>
+                <w:rFonts w:ascii="Tahoma" w:cs="Tahoma" w:eastAsia="Tahoma" w:hAnsi="Tahoma"/>
+                <w:sz w:val="18"/>
+                <w:szCs w:val="18"/>
+                <w:rtl/>
+              </w:rPr>
+              <w:t xml:space="preserve">Rationale</w:t>
+            </w:r>
+          </w:p>
+        </w:tc>
+        <w:tc>
+          <w:tcPr>
+            <w:tcW w:type="dxa" w:w="3740"/>
+            <w:shd w:fill="f9f9f7" w:val="clear"/>
+          </w:tcPr>
+          <w:p>
+            <w:pPr>
+              <w:bidi/>
+              <w:jc w:val="center"/>
+            </w:pPr>
+            <w:r>
+              <w:rPr>
+                <w:rFonts w:ascii="Tahoma" w:cs="Tahoma" w:eastAsia="Tahoma" w:hAnsi="Tahoma"/>
+                <w:sz w:val="18"/>
+                <w:szCs w:val="18"/>
+                <w:rtl/>
+              </w:rPr>
+              <w:t xml:space="preserve">بخش ۱.۱–۱.۲</w:t>
+            </w:r>
+          </w:p>
+        </w:tc>
+      </w:tr>
+      <w:tr>
+        <w:tc>
+          <w:tcPr>
+            <w:tcW w:type="dxa" w:w="748"/>
+            <w:shd w:fill="ffffff" w:val="clear"/>
+          </w:tcPr>
+          <w:p>
+            <w:pPr>
+              <w:bidi/>
+              <w:jc w:val="right"/>
+            </w:pPr>
+            <w:r>
+              <w:rPr>
+                <w:rFonts w:ascii="Tahoma" w:cs="Tahoma" w:eastAsia="Tahoma" w:hAnsi="Tahoma"/>
+                <w:sz w:val="18"/>
+                <w:szCs w:val="18"/>
+                <w:rtl/>
+              </w:rPr>
+              <w:t xml:space="preserve">۴</w:t>
+            </w:r>
+          </w:p>
+        </w:tc>
+        <w:tc>
+          <w:tcPr>
+            <w:tcW w:type="dxa" w:w="4862"/>
+            <w:shd w:fill="ffffff" w:val="clear"/>
+          </w:tcPr>
+          <w:p>
+            <w:pPr>
+              <w:bidi/>
+              <w:jc w:val="center"/>
+            </w:pPr>
+            <w:r>
+              <w:rPr>
+                <w:rFonts w:ascii="Tahoma" w:cs="Tahoma" w:eastAsia="Tahoma" w:hAnsi="Tahoma"/>
+                <w:sz w:val="18"/>
+                <w:szCs w:val="18"/>
+                <w:rtl/>
+              </w:rPr>
+              <w:t xml:space="preserve">Objectives</w:t>
+            </w:r>
+          </w:p>
+        </w:tc>
+        <w:tc>
+          <w:tcPr>
+            <w:tcW w:type="dxa" w:w="3740"/>
+            <w:shd w:fill="ffffff" w:val="clear"/>
+          </w:tcPr>
+          <w:p>
+            <w:pPr>
+              <w:bidi/>
+              <w:jc w:val="center"/>
+            </w:pPr>
+            <w:r>
+              <w:rPr>
+                <w:rFonts w:ascii="Tahoma" w:cs="Tahoma" w:eastAsia="Tahoma" w:hAnsi="Tahoma"/>
+                <w:sz w:val="18"/>
+                <w:szCs w:val="18"/>
+                <w:rtl/>
+              </w:rPr>
+              <w:t xml:space="preserve">چکیده (هدف) و بخش ۱.۲؛ عملیاتی‌سازی گزینه (ب) در بخش ۲.۲</w:t>
+            </w:r>
+          </w:p>
+        </w:tc>
+      </w:tr>
+      <w:tr>
+        <w:tc>
+          <w:tcPr>
+            <w:tcW w:type="dxa" w:w="748"/>
+            <w:shd w:fill="f9f9f7" w:val="clear"/>
+          </w:tcPr>
+          <w:p>
+            <w:pPr>
+              <w:bidi/>
+              <w:jc w:val="right"/>
+            </w:pPr>
+            <w:r>
+              <w:rPr>
+                <w:rFonts w:ascii="Tahoma" w:cs="Tahoma" w:eastAsia="Tahoma" w:hAnsi="Tahoma"/>
+                <w:sz w:val="18"/>
+                <w:szCs w:val="18"/>
+                <w:rtl/>
+              </w:rPr>
+              <w:t xml:space="preserve">۵</w:t>
+            </w:r>
+          </w:p>
+        </w:tc>
+        <w:tc>
+          <w:tcPr>
+            <w:tcW w:type="dxa" w:w="4862"/>
+            <w:shd w:fill="f9f9f7" w:val="clear"/>
+          </w:tcPr>
+          <w:p>
+            <w:pPr>
+              <w:bidi/>
+              <w:jc w:val="center"/>
+            </w:pPr>
+            <w:r>
+              <w:rPr>
+                <w:rFonts w:ascii="Tahoma" w:cs="Tahoma" w:eastAsia="Tahoma" w:hAnsi="Tahoma"/>
+                <w:sz w:val="18"/>
+                <w:szCs w:val="18"/>
+                <w:rtl/>
+              </w:rPr>
+              <w:t xml:space="preserve">Protocol and registration</w:t>
+            </w:r>
+          </w:p>
+        </w:tc>
+        <w:tc>
+          <w:tcPr>
+            <w:tcW w:type="dxa" w:w="3740"/>
+            <w:shd w:fill="f9f9f7" w:val="clear"/>
+          </w:tcPr>
+          <w:p>
+            <w:pPr>
+              <w:bidi/>
+              <w:jc w:val="center"/>
+            </w:pPr>
+            <w:r>
+              <w:rPr>
+                <w:rFonts w:ascii="Tahoma" w:cs="Tahoma" w:eastAsia="Tahoma" w:hAnsi="Tahoma"/>
+                <w:sz w:val="18"/>
+                <w:szCs w:val="18"/>
+                <w:rtl/>
+              </w:rPr>
+              <w:t xml:space="preserve">بخش ۲.۱ (پیش‌ثبت نشده — محدودیت ۱، بخش ۵)</w:t>
+            </w:r>
+          </w:p>
+        </w:tc>
+      </w:tr>
+      <w:tr>
+        <w:tc>
+          <w:tcPr>
+            <w:tcW w:type="dxa" w:w="748"/>
+            <w:shd w:fill="ffffff" w:val="clear"/>
+          </w:tcPr>
+          <w:p>
+            <w:pPr>
+              <w:bidi/>
+              <w:jc w:val="right"/>
+            </w:pPr>
+            <w:r>
+              <w:rPr>
+                <w:rFonts w:ascii="Tahoma" w:cs="Tahoma" w:eastAsia="Tahoma" w:hAnsi="Tahoma"/>
+                <w:sz w:val="18"/>
+                <w:szCs w:val="18"/>
+                <w:rtl/>
+              </w:rPr>
+              <w:t xml:space="preserve">۶</w:t>
+            </w:r>
+          </w:p>
+        </w:tc>
+        <w:tc>
+          <w:tcPr>
+            <w:tcW w:type="dxa" w:w="4862"/>
+            <w:shd w:fill="ffffff" w:val="clear"/>
+          </w:tcPr>
+          <w:p>
+            <w:pPr>
+              <w:bidi/>
+              <w:jc w:val="center"/>
+            </w:pPr>
+            <w:r>
+              <w:rPr>
+                <w:rFonts w:ascii="Tahoma" w:cs="Tahoma" w:eastAsia="Tahoma" w:hAnsi="Tahoma"/>
+                <w:sz w:val="18"/>
+                <w:szCs w:val="18"/>
+                <w:rtl/>
+              </w:rPr>
+              <w:t xml:space="preserve">Eligibility criteria</w:t>
+            </w:r>
+          </w:p>
+        </w:tc>
+        <w:tc>
+          <w:tcPr>
+            <w:tcW w:type="dxa" w:w="3740"/>
+            <w:shd w:fill="ffffff" w:val="clear"/>
+          </w:tcPr>
+          <w:p>
+            <w:pPr>
+              <w:bidi/>
+              <w:jc w:val="center"/>
+            </w:pPr>
+            <w:r>
+              <w:rPr>
+                <w:rFonts w:ascii="Tahoma" w:cs="Tahoma" w:eastAsia="Tahoma" w:hAnsi="Tahoma"/>
+                <w:sz w:val="18"/>
+                <w:szCs w:val="18"/>
+                <w:rtl/>
+              </w:rPr>
+              <w:t xml:space="preserve">بخش ۲.۲ (جدول PCC + عملیاتی‌سازی صریح)</w:t>
+            </w:r>
+          </w:p>
+        </w:tc>
+      </w:tr>
+      <w:tr>
+        <w:tc>
+          <w:tcPr>
+            <w:tcW w:type="dxa" w:w="748"/>
+            <w:shd w:fill="f9f9f7" w:val="clear"/>
+          </w:tcPr>
+          <w:p>
+            <w:pPr>
+              <w:bidi/>
+              <w:jc w:val="right"/>
+            </w:pPr>
+            <w:r>
+              <w:rPr>
+                <w:rFonts w:ascii="Tahoma" w:cs="Tahoma" w:eastAsia="Tahoma" w:hAnsi="Tahoma"/>
+                <w:sz w:val="18"/>
+                <w:szCs w:val="18"/>
+                <w:rtl/>
+              </w:rPr>
+              <w:t xml:space="preserve">۷</w:t>
+            </w:r>
+          </w:p>
+        </w:tc>
+        <w:tc>
+          <w:tcPr>
+            <w:tcW w:type="dxa" w:w="4862"/>
+            <w:shd w:fill="f9f9f7" w:val="clear"/>
+          </w:tcPr>
+          <w:p>
+            <w:pPr>
+              <w:bidi/>
+              <w:jc w:val="center"/>
+            </w:pPr>
+            <w:r>
+              <w:rPr>
+                <w:rFonts w:ascii="Tahoma" w:cs="Tahoma" w:eastAsia="Tahoma" w:hAnsi="Tahoma"/>
+                <w:sz w:val="18"/>
+                <w:szCs w:val="18"/>
+                <w:rtl/>
+              </w:rPr>
+              <w:t xml:space="preserve">Information sources</w:t>
+            </w:r>
+          </w:p>
+        </w:tc>
+        <w:tc>
+          <w:tcPr>
+            <w:tcW w:type="dxa" w:w="3740"/>
+            <w:shd w:fill="f9f9f7" w:val="clear"/>
+          </w:tcPr>
+          <w:p>
+            <w:pPr>
+              <w:bidi/>
+              <w:jc w:val="center"/>
+            </w:pPr>
+            <w:r>
+              <w:rPr>
+                <w:rFonts w:ascii="Tahoma" w:cs="Tahoma" w:eastAsia="Tahoma" w:hAnsi="Tahoma"/>
+                <w:sz w:val="18"/>
+                <w:szCs w:val="18"/>
+                <w:rtl/>
+              </w:rPr>
+              <w:t xml:space="preserve">بخش ۲.۳</w:t>
+            </w:r>
+          </w:p>
+        </w:tc>
+      </w:tr>
+      <w:tr>
+        <w:tc>
+          <w:tcPr>
+            <w:tcW w:type="dxa" w:w="748"/>
+            <w:shd w:fill="ffffff" w:val="clear"/>
+          </w:tcPr>
+          <w:p>
+            <w:pPr>
+              <w:bidi/>
+              <w:jc w:val="right"/>
+            </w:pPr>
+            <w:r>
+              <w:rPr>
+                <w:rFonts w:ascii="Tahoma" w:cs="Tahoma" w:eastAsia="Tahoma" w:hAnsi="Tahoma"/>
+                <w:sz w:val="18"/>
+                <w:szCs w:val="18"/>
+                <w:rtl/>
+              </w:rPr>
+              <w:t xml:space="preserve">۸</w:t>
+            </w:r>
+          </w:p>
+        </w:tc>
+        <w:tc>
+          <w:tcPr>
+            <w:tcW w:type="dxa" w:w="4862"/>
+            <w:shd w:fill="ffffff" w:val="clear"/>
+          </w:tcPr>
+          <w:p>
+            <w:pPr>
+              <w:bidi/>
+              <w:jc w:val="center"/>
+            </w:pPr>
+            <w:r>
+              <w:rPr>
+                <w:rFonts w:ascii="Tahoma" w:cs="Tahoma" w:eastAsia="Tahoma" w:hAnsi="Tahoma"/>
+                <w:sz w:val="18"/>
+                <w:szCs w:val="18"/>
+                <w:rtl/>
+              </w:rPr>
+              <w:t xml:space="preserve">Search</w:t>
+            </w:r>
+          </w:p>
+        </w:tc>
+        <w:tc>
+          <w:tcPr>
+            <w:tcW w:type="dxa" w:w="3740"/>
+            <w:shd w:fill="ffffff" w:val="clear"/>
+          </w:tcPr>
+          <w:p>
+            <w:pPr>
+              <w:bidi/>
+              <w:jc w:val="center"/>
+            </w:pPr>
+            <w:r>
+              <w:rPr>
+                <w:rFonts w:ascii="Tahoma" w:cs="Tahoma" w:eastAsia="Tahoma" w:hAnsi="Tahoma"/>
+                <w:sz w:val="18"/>
+                <w:szCs w:val="18"/>
+                <w:rtl/>
+              </w:rPr>
+              <w:t xml:space="preserve">بخش ۲.۳ و پیوست ب (عبارت‌های کامل جست‌وجو)</w:t>
+            </w:r>
+          </w:p>
+        </w:tc>
+      </w:tr>
+      <w:tr>
+        <w:tc>
+          <w:tcPr>
+            <w:tcW w:type="dxa" w:w="748"/>
+            <w:shd w:fill="f9f9f7" w:val="clear"/>
+          </w:tcPr>
+          <w:p>
+            <w:pPr>
+              <w:bidi/>
+              <w:jc w:val="right"/>
+            </w:pPr>
+            <w:r>
+              <w:rPr>
+                <w:rFonts w:ascii="Tahoma" w:cs="Tahoma" w:eastAsia="Tahoma" w:hAnsi="Tahoma"/>
+                <w:sz w:val="18"/>
+                <w:szCs w:val="18"/>
+                <w:rtl/>
+              </w:rPr>
+              <w:t xml:space="preserve">۹</w:t>
+            </w:r>
+          </w:p>
+        </w:tc>
+        <w:tc>
+          <w:tcPr>
+            <w:tcW w:type="dxa" w:w="4862"/>
+            <w:shd w:fill="f9f9f7" w:val="clear"/>
+          </w:tcPr>
+          <w:p>
+            <w:pPr>
+              <w:bidi/>
+              <w:jc w:val="center"/>
+            </w:pPr>
+            <w:r>
+              <w:rPr>
+                <w:rFonts w:ascii="Tahoma" w:cs="Tahoma" w:eastAsia="Tahoma" w:hAnsi="Tahoma"/>
+                <w:sz w:val="18"/>
+                <w:szCs w:val="18"/>
+                <w:rtl/>
+              </w:rPr>
+              <w:t xml:space="preserve">Selection of sources of evidence</w:t>
+            </w:r>
+          </w:p>
+        </w:tc>
+        <w:tc>
+          <w:tcPr>
+            <w:tcW w:type="dxa" w:w="3740"/>
+            <w:shd w:fill="f9f9f7" w:val="clear"/>
+          </w:tcPr>
+          <w:p>
+            <w:pPr>
+              <w:bidi/>
+              <w:jc w:val="center"/>
+            </w:pPr>
+            <w:r>
+              <w:rPr>
+                <w:rFonts w:ascii="Tahoma" w:cs="Tahoma" w:eastAsia="Tahoma" w:hAnsi="Tahoma"/>
+                <w:sz w:val="18"/>
+                <w:szCs w:val="18"/>
+                <w:rtl/>
+              </w:rPr>
+              <w:t xml:space="preserve">بخش ۲.۴</w:t>
+            </w:r>
+          </w:p>
+        </w:tc>
+      </w:tr>
+      <w:tr>
+        <w:tc>
+          <w:tcPr>
+            <w:tcW w:type="dxa" w:w="748"/>
+            <w:shd w:fill="ffffff" w:val="clear"/>
+          </w:tcPr>
+          <w:p>
+            <w:pPr>
+              <w:bidi/>
+              <w:jc w:val="right"/>
+            </w:pPr>
+            <w:r>
+              <w:rPr>
+                <w:rFonts w:ascii="Tahoma" w:cs="Tahoma" w:eastAsia="Tahoma" w:hAnsi="Tahoma"/>
+                <w:sz w:val="18"/>
+                <w:szCs w:val="18"/>
+                <w:rtl/>
+              </w:rPr>
+              <w:t xml:space="preserve">۱۰</w:t>
+            </w:r>
+          </w:p>
+        </w:tc>
+        <w:tc>
+          <w:tcPr>
+            <w:tcW w:type="dxa" w:w="4862"/>
+            <w:shd w:fill="ffffff" w:val="clear"/>
+          </w:tcPr>
+          <w:p>
+            <w:pPr>
+              <w:bidi/>
+              <w:jc w:val="center"/>
+            </w:pPr>
+            <w:r>
+              <w:rPr>
+                <w:rFonts w:ascii="Tahoma" w:cs="Tahoma" w:eastAsia="Tahoma" w:hAnsi="Tahoma"/>
+                <w:sz w:val="18"/>
+                <w:szCs w:val="18"/>
+                <w:rtl/>
+              </w:rPr>
+              <w:t xml:space="preserve">Data charting process</w:t>
+            </w:r>
+          </w:p>
+        </w:tc>
+        <w:tc>
+          <w:tcPr>
+            <w:tcW w:type="dxa" w:w="3740"/>
+            <w:shd w:fill="ffffff" w:val="clear"/>
+          </w:tcPr>
+          <w:p>
+            <w:pPr>
+              <w:bidi/>
+              <w:jc w:val="center"/>
+            </w:pPr>
+            <w:r>
+              <w:rPr>
+                <w:rFonts w:ascii="Tahoma" w:cs="Tahoma" w:eastAsia="Tahoma" w:hAnsi="Tahoma"/>
+                <w:sz w:val="18"/>
+                <w:szCs w:val="18"/>
+                <w:rtl/>
+              </w:rPr>
+              <w:t xml:space="preserve">بخش ۲.۵</w:t>
+            </w:r>
+          </w:p>
+        </w:tc>
+      </w:tr>
+      <w:tr>
+        <w:tc>
+          <w:tcPr>
+            <w:tcW w:type="dxa" w:w="748"/>
+            <w:shd w:fill="f9f9f7" w:val="clear"/>
+          </w:tcPr>
+          <w:p>
+            <w:pPr>
+              <w:bidi/>
+              <w:jc w:val="right"/>
+            </w:pPr>
+            <w:r>
+              <w:rPr>
+                <w:rFonts w:ascii="Tahoma" w:cs="Tahoma" w:eastAsia="Tahoma" w:hAnsi="Tahoma"/>
+                <w:sz w:val="18"/>
+                <w:szCs w:val="18"/>
+                <w:rtl/>
+              </w:rPr>
+              <w:t xml:space="preserve">۱۱</w:t>
+            </w:r>
+          </w:p>
+        </w:tc>
+        <w:tc>
+          <w:tcPr>
+            <w:tcW w:type="dxa" w:w="4862"/>
+            <w:shd w:fill="f9f9f7" w:val="clear"/>
+          </w:tcPr>
+          <w:p>
+            <w:pPr>
+              <w:bidi/>
+              <w:jc w:val="center"/>
+            </w:pPr>
+            <w:r>
+              <w:rPr>
+                <w:rFonts w:ascii="Tahoma" w:cs="Tahoma" w:eastAsia="Tahoma" w:hAnsi="Tahoma"/>
+                <w:sz w:val="18"/>
+                <w:szCs w:val="18"/>
+                <w:rtl/>
+              </w:rPr>
+              <w:t xml:space="preserve">Data items</w:t>
+            </w:r>
+          </w:p>
+        </w:tc>
+        <w:tc>
+          <w:tcPr>
+            <w:tcW w:type="dxa" w:w="3740"/>
+            <w:shd w:fill="f9f9f7" w:val="clear"/>
+          </w:tcPr>
+          <w:p>
+            <w:pPr>
+              <w:bidi/>
+              <w:jc w:val="center"/>
+            </w:pPr>
+            <w:r>
+              <w:rPr>
+                <w:rFonts w:ascii="Tahoma" w:cs="Tahoma" w:eastAsia="Tahoma" w:hAnsi="Tahoma"/>
+                <w:sz w:val="18"/>
+                <w:szCs w:val="18"/>
+                <w:rtl/>
+              </w:rPr>
+              <w:t xml:space="preserve">بخش ۲.۵ (شش بُعد کدگذاری)</w:t>
+            </w:r>
+          </w:p>
+        </w:tc>
+      </w:tr>
+      <w:tr>
+        <w:tc>
+          <w:tcPr>
+            <w:tcW w:type="dxa" w:w="748"/>
+            <w:shd w:fill="ffffff" w:val="clear"/>
+          </w:tcPr>
+          <w:p>
+            <w:pPr>
+              <w:bidi/>
+              <w:jc w:val="right"/>
+            </w:pPr>
+            <w:r>
+              <w:rPr>
+                <w:rFonts w:ascii="Tahoma" w:cs="Tahoma" w:eastAsia="Tahoma" w:hAnsi="Tahoma"/>
+                <w:sz w:val="18"/>
+                <w:szCs w:val="18"/>
+                <w:rtl/>
+              </w:rPr>
+              <w:t xml:space="preserve">۱۲*</w:t>
+            </w:r>
+          </w:p>
+        </w:tc>
+        <w:tc>
+          <w:tcPr>
+            <w:tcW w:type="dxa" w:w="4862"/>
+            <w:shd w:fill="ffffff" w:val="clear"/>
+          </w:tcPr>
+          <w:p>
+            <w:pPr>
+              <w:bidi/>
+              <w:jc w:val="center"/>
+            </w:pPr>
+            <w:r>
+              <w:rPr>
+                <w:rFonts w:ascii="Tahoma" w:cs="Tahoma" w:eastAsia="Tahoma" w:hAnsi="Tahoma"/>
+                <w:sz w:val="18"/>
+                <w:szCs w:val="18"/>
+                <w:rtl/>
+              </w:rPr>
+              <w:t xml:space="preserve">Critical appraisal of individual sources of evidence (اختیاری)</w:t>
+            </w:r>
+          </w:p>
+        </w:tc>
+        <w:tc>
+          <w:tcPr>
+            <w:tcW w:type="dxa" w:w="3740"/>
+            <w:shd w:fill="ffffff" w:val="clear"/>
+          </w:tcPr>
+          <w:p>
+            <w:pPr>
+              <w:bidi/>
+              <w:jc w:val="center"/>
+            </w:pPr>
+            <w:r>
+              <w:rPr>
+                <w:rFonts w:ascii="Tahoma" w:cs="Tahoma" w:eastAsia="Tahoma" w:hAnsi="Tahoma"/>
+                <w:sz w:val="18"/>
+                <w:szCs w:val="18"/>
+                <w:rtl/>
+              </w:rPr>
+              <w:t xml:space="preserve">بخش ۲.۶ (انتخاب آگاهانه عدم انجام، سازگار با PRISMA-ScR)</w:t>
+            </w:r>
+          </w:p>
+        </w:tc>
+      </w:tr>
+      <w:tr>
+        <w:tc>
+          <w:tcPr>
+            <w:tcW w:type="dxa" w:w="748"/>
+            <w:shd w:fill="f9f9f7" w:val="clear"/>
+          </w:tcPr>
+          <w:p>
+            <w:pPr>
+              <w:bidi/>
+              <w:jc w:val="right"/>
+            </w:pPr>
+            <w:r>
+              <w:rPr>
+                <w:rFonts w:ascii="Tahoma" w:cs="Tahoma" w:eastAsia="Tahoma" w:hAnsi="Tahoma"/>
+                <w:sz w:val="18"/>
+                <w:szCs w:val="18"/>
+                <w:rtl/>
+              </w:rPr>
+              <w:t xml:space="preserve">۱۳</w:t>
+            </w:r>
+          </w:p>
+        </w:tc>
+        <w:tc>
+          <w:tcPr>
+            <w:tcW w:type="dxa" w:w="4862"/>
+            <w:shd w:fill="f9f9f7" w:val="clear"/>
+          </w:tcPr>
+          <w:p>
+            <w:pPr>
+              <w:bidi/>
+              <w:jc w:val="center"/>
+            </w:pPr>
+            <w:r>
+              <w:rPr>
+                <w:rFonts w:ascii="Tahoma" w:cs="Tahoma" w:eastAsia="Tahoma" w:hAnsi="Tahoma"/>
+                <w:sz w:val="18"/>
+                <w:szCs w:val="18"/>
+                <w:rtl/>
+              </w:rPr>
+              <w:t xml:space="preserve">Synthesis of results</w:t>
+            </w:r>
+          </w:p>
+        </w:tc>
+        <w:tc>
+          <w:tcPr>
+            <w:tcW w:type="dxa" w:w="3740"/>
+            <w:shd w:fill="f9f9f7" w:val="clear"/>
+          </w:tcPr>
+          <w:p>
+            <w:pPr>
+              <w:bidi/>
+              <w:jc w:val="center"/>
+            </w:pPr>
+            <w:r>
+              <w:rPr>
+                <w:rFonts w:ascii="Tahoma" w:cs="Tahoma" w:eastAsia="Tahoma" w:hAnsi="Tahoma"/>
+                <w:sz w:val="18"/>
+                <w:szCs w:val="18"/>
+                <w:rtl/>
+              </w:rPr>
+              <w:t xml:space="preserve">بخش ۲.۷</w:t>
+            </w:r>
+          </w:p>
+        </w:tc>
+      </w:tr>
+      <w:tr>
+        <w:tc>
+          <w:tcPr>
+            <w:tcW w:type="dxa" w:w="748"/>
+            <w:shd w:fill="ffffff" w:val="clear"/>
+          </w:tcPr>
+          <w:p>
+            <w:pPr>
+              <w:bidi/>
+              <w:jc w:val="right"/>
+            </w:pPr>
+            <w:r>
+              <w:rPr>
+                <w:rFonts w:ascii="Tahoma" w:cs="Tahoma" w:eastAsia="Tahoma" w:hAnsi="Tahoma"/>
+                <w:sz w:val="18"/>
+                <w:szCs w:val="18"/>
+                <w:rtl/>
+              </w:rPr>
+              <w:t xml:space="preserve">۱۴</w:t>
+            </w:r>
+          </w:p>
+        </w:tc>
+        <w:tc>
+          <w:tcPr>
+            <w:tcW w:type="dxa" w:w="4862"/>
+            <w:shd w:fill="ffffff" w:val="clear"/>
+          </w:tcPr>
+          <w:p>
+            <w:pPr>
+              <w:bidi/>
+              <w:jc w:val="center"/>
+            </w:pPr>
+            <w:r>
+              <w:rPr>
+                <w:rFonts w:ascii="Tahoma" w:cs="Tahoma" w:eastAsia="Tahoma" w:hAnsi="Tahoma"/>
+                <w:sz w:val="18"/>
+                <w:szCs w:val="18"/>
+                <w:rtl/>
+              </w:rPr>
+              <w:t xml:space="preserve">Selection of sources of evidence (نتایج)</w:t>
+            </w:r>
+          </w:p>
+        </w:tc>
+        <w:tc>
+          <w:tcPr>
+            <w:tcW w:type="dxa" w:w="3740"/>
+            <w:shd w:fill="ffffff" w:val="clear"/>
+          </w:tcPr>
+          <w:p>
+            <w:pPr>
+              <w:bidi/>
+              <w:jc w:val="center"/>
+            </w:pPr>
+            <w:r>
+              <w:rPr>
+                <w:rFonts w:ascii="Tahoma" w:cs="Tahoma" w:eastAsia="Tahoma" w:hAnsi="Tahoma"/>
+                <w:sz w:val="18"/>
+                <w:szCs w:val="18"/>
+                <w:rtl/>
+              </w:rPr>
+              <w:t xml:space="preserve">بخش ۳.۱ و شکل ۱</w:t>
+            </w:r>
+          </w:p>
+        </w:tc>
+      </w:tr>
+      <w:tr>
+        <w:tc>
+          <w:tcPr>
+            <w:tcW w:type="dxa" w:w="748"/>
+            <w:shd w:fill="f9f9f7" w:val="clear"/>
+          </w:tcPr>
+          <w:p>
+            <w:pPr>
+              <w:bidi/>
+              <w:jc w:val="right"/>
+            </w:pPr>
+            <w:r>
+              <w:rPr>
+                <w:rFonts w:ascii="Tahoma" w:cs="Tahoma" w:eastAsia="Tahoma" w:hAnsi="Tahoma"/>
+                <w:sz w:val="18"/>
+                <w:szCs w:val="18"/>
+                <w:rtl/>
+              </w:rPr>
+              <w:t xml:space="preserve">۱۵</w:t>
+            </w:r>
+          </w:p>
+        </w:tc>
+        <w:tc>
+          <w:tcPr>
+            <w:tcW w:type="dxa" w:w="4862"/>
+            <w:shd w:fill="f9f9f7" w:val="clear"/>
+          </w:tcPr>
+          <w:p>
+            <w:pPr>
+              <w:bidi/>
+              <w:jc w:val="center"/>
+            </w:pPr>
+            <w:r>
+              <w:rPr>
+                <w:rFonts w:ascii="Tahoma" w:cs="Tahoma" w:eastAsia="Tahoma" w:hAnsi="Tahoma"/>
+                <w:sz w:val="18"/>
+                <w:szCs w:val="18"/>
+                <w:rtl/>
+              </w:rPr>
+              <w:t xml:space="preserve">Characteristics of sources of evidence</w:t>
+            </w:r>
+          </w:p>
+        </w:tc>
+        <w:tc>
+          <w:tcPr>
+            <w:tcW w:type="dxa" w:w="3740"/>
+            <w:shd w:fill="f9f9f7" w:val="clear"/>
+          </w:tcPr>
+          <w:p>
+            <w:pPr>
+              <w:bidi/>
+              <w:jc w:val="center"/>
+            </w:pPr>
+            <w:r>
+              <w:rPr>
+                <w:rFonts w:ascii="Tahoma" w:cs="Tahoma" w:eastAsia="Tahoma" w:hAnsi="Tahoma"/>
+                <w:sz w:val="18"/>
+                <w:szCs w:val="18"/>
+                <w:rtl/>
+              </w:rPr>
+              <w:t xml:space="preserve">بخش ۳.۲</w:t>
+            </w:r>
+          </w:p>
+        </w:tc>
+      </w:tr>
+      <w:tr>
+        <w:tc>
+          <w:tcPr>
+            <w:tcW w:type="dxa" w:w="748"/>
+            <w:shd w:fill="ffffff" w:val="clear"/>
+          </w:tcPr>
+          <w:p>
+            <w:pPr>
+              <w:bidi/>
+              <w:jc w:val="right"/>
+            </w:pPr>
+            <w:r>
+              <w:rPr>
+                <w:rFonts w:ascii="Tahoma" w:cs="Tahoma" w:eastAsia="Tahoma" w:hAnsi="Tahoma"/>
+                <w:sz w:val="18"/>
+                <w:szCs w:val="18"/>
+                <w:rtl/>
+              </w:rPr>
+              <w:t xml:space="preserve">۱۶*</w:t>
+            </w:r>
+          </w:p>
+        </w:tc>
+        <w:tc>
+          <w:tcPr>
+            <w:tcW w:type="dxa" w:w="4862"/>
+            <w:shd w:fill="ffffff" w:val="clear"/>
+          </w:tcPr>
+          <w:p>
+            <w:pPr>
+              <w:bidi/>
+              <w:jc w:val="center"/>
+            </w:pPr>
+            <w:r>
+              <w:rPr>
+                <w:rFonts w:ascii="Tahoma" w:cs="Tahoma" w:eastAsia="Tahoma" w:hAnsi="Tahoma"/>
+                <w:sz w:val="18"/>
+                <w:szCs w:val="18"/>
+                <w:rtl/>
+              </w:rPr>
+              <w:t xml:space="preserve">Critical appraisal within sources of evidence (اختیاری)</w:t>
+            </w:r>
+          </w:p>
+        </w:tc>
+        <w:tc>
+          <w:tcPr>
+            <w:tcW w:type="dxa" w:w="3740"/>
+            <w:shd w:fill="ffffff" w:val="clear"/>
+          </w:tcPr>
+          <w:p>
+            <w:pPr>
+              <w:bidi/>
+              <w:jc w:val="center"/>
+            </w:pPr>
+            <w:r>
+              <w:rPr>
+                <w:rFonts w:ascii="Tahoma" w:cs="Tahoma" w:eastAsia="Tahoma" w:hAnsi="Tahoma"/>
+                <w:sz w:val="18"/>
+                <w:szCs w:val="18"/>
+                <w:rtl/>
+              </w:rPr>
+              <w:t xml:space="preserve">انجام نشد (بخش ۲.۶ و ۵)</w:t>
+            </w:r>
+          </w:p>
+        </w:tc>
+      </w:tr>
+      <w:tr>
+        <w:tc>
+          <w:tcPr>
+            <w:tcW w:type="dxa" w:w="748"/>
+            <w:shd w:fill="f9f9f7" w:val="clear"/>
+          </w:tcPr>
+          <w:p>
+            <w:pPr>
+              <w:bidi/>
+              <w:jc w:val="right"/>
+            </w:pPr>
+            <w:r>
+              <w:rPr>
+                <w:rFonts w:ascii="Tahoma" w:cs="Tahoma" w:eastAsia="Tahoma" w:hAnsi="Tahoma"/>
+                <w:sz w:val="18"/>
+                <w:szCs w:val="18"/>
+                <w:rtl/>
+              </w:rPr>
+              <w:t xml:space="preserve">۱۷</w:t>
+            </w:r>
+          </w:p>
+        </w:tc>
+        <w:tc>
+          <w:tcPr>
+            <w:tcW w:type="dxa" w:w="4862"/>
+            <w:shd w:fill="f9f9f7" w:val="clear"/>
+          </w:tcPr>
+          <w:p>
+            <w:pPr>
+              <w:bidi/>
+              <w:jc w:val="center"/>
+            </w:pPr>
+            <w:r>
+              <w:rPr>
+                <w:rFonts w:ascii="Tahoma" w:cs="Tahoma" w:eastAsia="Tahoma" w:hAnsi="Tahoma"/>
+                <w:sz w:val="18"/>
+                <w:szCs w:val="18"/>
+                <w:rtl/>
+              </w:rPr>
+              <w:t xml:space="preserve">Results of individual sources of evidence</w:t>
+            </w:r>
+          </w:p>
+        </w:tc>
+        <w:tc>
+          <w:tcPr>
+            <w:tcW w:type="dxa" w:w="3740"/>
+            <w:shd w:fill="f9f9f7" w:val="clear"/>
+          </w:tcPr>
+          <w:p>
+            <w:pPr>
+              <w:bidi/>
+              <w:jc w:val="center"/>
+            </w:pPr>
+            <w:r>
+              <w:rPr>
+                <w:rFonts w:ascii="Tahoma" w:cs="Tahoma" w:eastAsia="Tahoma" w:hAnsi="Tahoma"/>
+                <w:sz w:val="18"/>
+                <w:szCs w:val="18"/>
+                <w:rtl/>
+              </w:rPr>
+              <w:t xml:space="preserve">data/coded_dataset_all.csv و data/master_registry.csv</w:t>
+            </w:r>
+          </w:p>
+        </w:tc>
+      </w:tr>
+      <w:tr>
+        <w:tc>
+          <w:tcPr>
+            <w:tcW w:type="dxa" w:w="748"/>
+            <w:shd w:fill="ffffff" w:val="clear"/>
+          </w:tcPr>
+          <w:p>
+            <w:pPr>
+              <w:bidi/>
+              <w:jc w:val="right"/>
+            </w:pPr>
+            <w:r>
+              <w:rPr>
+                <w:rFonts w:ascii="Tahoma" w:cs="Tahoma" w:eastAsia="Tahoma" w:hAnsi="Tahoma"/>
+                <w:sz w:val="18"/>
+                <w:szCs w:val="18"/>
+                <w:rtl/>
+              </w:rPr>
+              <w:t xml:space="preserve">۱۸</w:t>
+            </w:r>
+          </w:p>
+        </w:tc>
+        <w:tc>
+          <w:tcPr>
+            <w:tcW w:type="dxa" w:w="4862"/>
+            <w:shd w:fill="ffffff" w:val="clear"/>
+          </w:tcPr>
+          <w:p>
+            <w:pPr>
+              <w:bidi/>
+              <w:jc w:val="center"/>
+            </w:pPr>
+            <w:r>
+              <w:rPr>
+                <w:rFonts w:ascii="Tahoma" w:cs="Tahoma" w:eastAsia="Tahoma" w:hAnsi="Tahoma"/>
+                <w:sz w:val="18"/>
+                <w:szCs w:val="18"/>
+                <w:rtl/>
+              </w:rPr>
+              <w:t xml:space="preserve">Synthesis of results (نتایج)</w:t>
+            </w:r>
+          </w:p>
+        </w:tc>
+        <w:tc>
+          <w:tcPr>
+            <w:tcW w:type="dxa" w:w="3740"/>
+            <w:shd w:fill="ffffff" w:val="clear"/>
+          </w:tcPr>
+          <w:p>
+            <w:pPr>
+              <w:bidi/>
+              <w:jc w:val="center"/>
+            </w:pPr>
+            <w:r>
+              <w:rPr>
+                <w:rFonts w:ascii="Tahoma" w:cs="Tahoma" w:eastAsia="Tahoma" w:hAnsi="Tahoma"/>
+                <w:sz w:val="18"/>
+                <w:szCs w:val="18"/>
+                <w:rtl/>
+              </w:rPr>
+              <w:t xml:space="preserve">بخش‌های ۳.۲–۳.۹</w:t>
+            </w:r>
+          </w:p>
+        </w:tc>
+      </w:tr>
+      <w:tr>
+        <w:tc>
+          <w:tcPr>
+            <w:tcW w:type="dxa" w:w="748"/>
+            <w:shd w:fill="f9f9f7" w:val="clear"/>
+          </w:tcPr>
+          <w:p>
+            <w:pPr>
+              <w:bidi/>
+              <w:jc w:val="right"/>
+            </w:pPr>
+            <w:r>
+              <w:rPr>
+                <w:rFonts w:ascii="Tahoma" w:cs="Tahoma" w:eastAsia="Tahoma" w:hAnsi="Tahoma"/>
+                <w:sz w:val="18"/>
+                <w:szCs w:val="18"/>
+                <w:rtl/>
+              </w:rPr>
+              <w:t xml:space="preserve">۱۹</w:t>
+            </w:r>
+          </w:p>
+        </w:tc>
+        <w:tc>
+          <w:tcPr>
+            <w:tcW w:type="dxa" w:w="4862"/>
+            <w:shd w:fill="f9f9f7" w:val="clear"/>
+          </w:tcPr>
+          <w:p>
+            <w:pPr>
+              <w:bidi/>
+              <w:jc w:val="center"/>
+            </w:pPr>
+            <w:r>
+              <w:rPr>
+                <w:rFonts w:ascii="Tahoma" w:cs="Tahoma" w:eastAsia="Tahoma" w:hAnsi="Tahoma"/>
+                <w:sz w:val="18"/>
+                <w:szCs w:val="18"/>
+                <w:rtl/>
+              </w:rPr>
+              <w:t xml:space="preserve">Summary of evidence</w:t>
+            </w:r>
+          </w:p>
+        </w:tc>
+        <w:tc>
+          <w:tcPr>
+            <w:tcW w:type="dxa" w:w="3740"/>
+            <w:shd w:fill="f9f9f7" w:val="clear"/>
+          </w:tcPr>
+          <w:p>
+            <w:pPr>
+              <w:bidi/>
+              <w:jc w:val="center"/>
+            </w:pPr>
+            <w:r>
+              <w:rPr>
+                <w:rFonts w:ascii="Tahoma" w:cs="Tahoma" w:eastAsia="Tahoma" w:hAnsi="Tahoma"/>
+                <w:sz w:val="18"/>
+                <w:szCs w:val="18"/>
+                <w:rtl/>
+              </w:rPr>
+              <w:t xml:space="preserve">بخش ۴.۱</w:t>
+            </w:r>
+          </w:p>
+        </w:tc>
+      </w:tr>
+      <w:tr>
+        <w:tc>
+          <w:tcPr>
+            <w:tcW w:type="dxa" w:w="748"/>
+            <w:shd w:fill="ffffff" w:val="clear"/>
+          </w:tcPr>
+          <w:p>
+            <w:pPr>
+              <w:bidi/>
+              <w:jc w:val="right"/>
+            </w:pPr>
+            <w:r>
+              <w:rPr>
+                <w:rFonts w:ascii="Tahoma" w:cs="Tahoma" w:eastAsia="Tahoma" w:hAnsi="Tahoma"/>
+                <w:sz w:val="18"/>
+                <w:szCs w:val="18"/>
+                <w:rtl/>
+              </w:rPr>
+              <w:t xml:space="preserve">۲۰</w:t>
+            </w:r>
+          </w:p>
+        </w:tc>
+        <w:tc>
+          <w:tcPr>
+            <w:tcW w:type="dxa" w:w="4862"/>
+            <w:shd w:fill="ffffff" w:val="clear"/>
+          </w:tcPr>
+          <w:p>
+            <w:pPr>
+              <w:bidi/>
+              <w:jc w:val="center"/>
+            </w:pPr>
+            <w:r>
+              <w:rPr>
+                <w:rFonts w:ascii="Tahoma" w:cs="Tahoma" w:eastAsia="Tahoma" w:hAnsi="Tahoma"/>
+                <w:sz w:val="18"/>
+                <w:szCs w:val="18"/>
+                <w:rtl/>
+              </w:rPr>
+              <w:t xml:space="preserve">Limitations</w:t>
+            </w:r>
+          </w:p>
+        </w:tc>
+        <w:tc>
+          <w:tcPr>
+            <w:tcW w:type="dxa" w:w="3740"/>
+            <w:shd w:fill="ffffff" w:val="clear"/>
+          </w:tcPr>
+          <w:p>
+            <w:pPr>
+              <w:bidi/>
+              <w:jc w:val="center"/>
+            </w:pPr>
+            <w:r>
+              <w:rPr>
+                <w:rFonts w:ascii="Tahoma" w:cs="Tahoma" w:eastAsia="Tahoma" w:hAnsi="Tahoma"/>
+                <w:sz w:val="18"/>
+                <w:szCs w:val="18"/>
+                <w:rtl/>
+              </w:rPr>
+              <w:t xml:space="preserve">بخش ۵ (۱۱ مورد مستند)</w:t>
+            </w:r>
+          </w:p>
+        </w:tc>
+      </w:tr>
+      <w:tr>
+        <w:tc>
+          <w:tcPr>
+            <w:tcW w:type="dxa" w:w="748"/>
+            <w:shd w:fill="f9f9f7" w:val="clear"/>
+          </w:tcPr>
+          <w:p>
+            <w:pPr>
+              <w:bidi/>
+              <w:jc w:val="right"/>
+            </w:pPr>
+            <w:r>
+              <w:rPr>
+                <w:rFonts w:ascii="Tahoma" w:cs="Tahoma" w:eastAsia="Tahoma" w:hAnsi="Tahoma"/>
+                <w:sz w:val="18"/>
+                <w:szCs w:val="18"/>
+                <w:rtl/>
+              </w:rPr>
+              <w:t xml:space="preserve">۲۱</w:t>
+            </w:r>
+          </w:p>
+        </w:tc>
+        <w:tc>
+          <w:tcPr>
+            <w:tcW w:type="dxa" w:w="4862"/>
+            <w:shd w:fill="f9f9f7" w:val="clear"/>
+          </w:tcPr>
+          <w:p>
+            <w:pPr>
+              <w:bidi/>
+              <w:jc w:val="center"/>
+            </w:pPr>
+            <w:r>
+              <w:rPr>
+                <w:rFonts w:ascii="Tahoma" w:cs="Tahoma" w:eastAsia="Tahoma" w:hAnsi="Tahoma"/>
+                <w:sz w:val="18"/>
+                <w:szCs w:val="18"/>
+                <w:rtl/>
+              </w:rPr>
+              <w:t xml:space="preserve">Conclusions</w:t>
+            </w:r>
+          </w:p>
+        </w:tc>
+        <w:tc>
+          <w:tcPr>
+            <w:tcW w:type="dxa" w:w="3740"/>
+            <w:shd w:fill="f9f9f7" w:val="clear"/>
+          </w:tcPr>
+          <w:p>
+            <w:pPr>
+              <w:bidi/>
+              <w:jc w:val="center"/>
+            </w:pPr>
+            <w:r>
+              <w:rPr>
+                <w:rFonts w:ascii="Tahoma" w:cs="Tahoma" w:eastAsia="Tahoma" w:hAnsi="Tahoma"/>
+                <w:sz w:val="18"/>
+                <w:szCs w:val="18"/>
+                <w:rtl/>
+              </w:rPr>
+              <w:t xml:space="preserve">بخش ۶</w:t>
+            </w:r>
+          </w:p>
+        </w:tc>
+      </w:tr>
+      <w:tr>
+        <w:tc>
+          <w:tcPr>
+            <w:tcW w:type="dxa" w:w="748"/>
+            <w:shd w:fill="ffffff" w:val="clear"/>
+          </w:tcPr>
+          <w:p>
+            <w:pPr>
+              <w:bidi/>
+              <w:jc w:val="right"/>
+            </w:pPr>
+            <w:r>
+              <w:rPr>
+                <w:rFonts w:ascii="Tahoma" w:cs="Tahoma" w:eastAsia="Tahoma" w:hAnsi="Tahoma"/>
+                <w:sz w:val="18"/>
+                <w:szCs w:val="18"/>
+                <w:rtl/>
+              </w:rPr>
+              <w:t xml:space="preserve">۲۲</w:t>
+            </w:r>
+          </w:p>
+        </w:tc>
+        <w:tc>
+          <w:tcPr>
+            <w:tcW w:type="dxa" w:w="4862"/>
+            <w:shd w:fill="ffffff" w:val="clear"/>
+          </w:tcPr>
+          <w:p>
+            <w:pPr>
+              <w:bidi/>
+              <w:jc w:val="center"/>
+            </w:pPr>
+            <w:r>
+              <w:rPr>
+                <w:rFonts w:ascii="Tahoma" w:cs="Tahoma" w:eastAsia="Tahoma" w:hAnsi="Tahoma"/>
+                <w:sz w:val="18"/>
+                <w:szCs w:val="18"/>
+                <w:rtl/>
+              </w:rPr>
+              <w:t xml:space="preserve">Funding</w:t>
+            </w:r>
+          </w:p>
+        </w:tc>
+        <w:tc>
+          <w:tcPr>
+            <w:tcW w:type="dxa" w:w="3740"/>
+            <w:shd w:fill="ffffff" w:val="clear"/>
+          </w:tcPr>
+          <w:p>
+            <w:pPr>
+              <w:bidi/>
+              <w:jc w:val="center"/>
+            </w:pPr>
+            <w:r>
+              <w:rPr>
+                <w:rFonts w:ascii="Tahoma" w:cs="Tahoma" w:eastAsia="Tahoma" w:hAnsi="Tahoma"/>
+                <w:sz w:val="18"/>
+                <w:szCs w:val="18"/>
+                <w:rtl/>
+              </w:rPr>
+              <w:t xml:space="preserve">بخش «تأمین مالی»</w:t>
+            </w:r>
+          </w:p>
+        </w:tc>
+      </w:tr>
+    </w:tbl>
+    <w:p>
+      <w:pPr>
+        <w:bidi/>
+        <w:spacing w:after="160" w:line="300"/>
+        <w:jc w:val="right"/>
+      </w:pPr>
+      <w:r>
+        <w:rPr>
+          <w:rFonts w:ascii="Tahoma" w:cs="Tahoma" w:eastAsia="Tahoma" w:hAnsi="Tahoma"/>
+          <w:rtl/>
+        </w:rPr>
+        <w:t xml:space="preserve">* موارد ۱۲ و ۱۶ (ارزیابی انتقادی/خطر سوگیری مطالعات منفرد) طبق راهنمای PRISMA-ScR برای مرورهای دامنه‌ای اختیاری‌اند؛ این پروژه آگاهانه از انجام آن‌ها صرف‌نظر کرد (بخش ۲.۶)، چون هدف نقشه‌برداری شواهد است، نه قضاوت کیفیت روش‌شناختی مطالعات فردی.</w:t>
       </w:r>
     </w:p>
     <w:p>

</xml_diff>

<commit_message>
Fix Introduction's research question/PCC framing left on the old narrow scope
Round 4 broadened the title, Abstract, Methods, and Conclusion to match
the actual (broader) eligibility criteria, but missed the Introduction:
its stated research question and Population-Concept-Context framing
(section 1.2) still described the narrower "digital + classically
psychological mechanism" scope, contradicting the rest of the paper.
Also named Adam et al. (2023) explicitly instead of "a review (2023)",
and pointed the novelty claim in section 1.2 to the fuller discussion
in section 4.4 (which now covers 5 adjacent reviews, not 2).

Co-Authored-By: Claude Sonnet 5 <noreply@anthropic.com>
Claude-Session: https://claude.ai/code/session_01WHdoH2brsuf2zg1uU5YHyB
</commit_message>
<xml_diff>
--- a/paper/burnout_scoping_review_paper.docx
+++ b/paper/burnout_scoping_review_paper.docx
@@ -504,7 +504,7 @@
           <w:rFonts w:ascii="Tahoma" w:cs="Tahoma" w:eastAsia="Tahoma" w:hAnsi="Tahoma"/>
           <w:rtl/>
         </w:rPr>
-        <w:t xml:space="preserve">پژوهش‌های مروری موجود در این حوزه معمولاً یکی از دو محدودیت را دارند: یا به یک گروه شغلی خاص (عمدتاً پرستاران یا کارکنان نظام سلامت) محدود شده‌اند، یا outcome اصلی‌شان استرس/سلامت روان عمومی است، نه فرسودگی شغلی به‌طور اختصاصی. به‌طور خاص، Yang و همکاران (۲۰۲۶) یک مرور سیستماتیک و متاآنالیز را منحصراً روی پرستاران انجام دادند، و مرور دیگری (۲۰۲۳) روی متخصصین سلامت با تمرکز بر کاربردهای دیجیتال متمرکز بود، بدون پوشش سایر مشاغل.</w:t>
+        <w:t xml:space="preserve">پژوهش‌های مروری موجود در این حوزه معمولاً یکی از دو محدودیت را دارند: یا به یک گروه شغلی خاص (عمدتاً پرستاران یا کارکنان نظام سلامت) محدود شده‌اند، یا outcome اصلی‌شان استرس/سلامت روان عمومی است، نه فرسودگی شغلی به‌طور اختصاصی. به‌طور خاص، Yang و همکاران (۲۰۲۶) یک مرور سیستماتیک و متاآنالیز را منحصراً روی پرستاران انجام دادند، و Adam و همکاران (۲۰۲۳) روی متخصصین سلامت با تمرکز بر کاربردهای دیجیتال متمرکز بودند، بدون پوشش سایر مشاغل (جدول مقایسه کامل در بخش ۴.۴).</w:t>
       </w:r>
     </w:p>
     <w:p>
@@ -538,7 +538,7 @@
           <w:rFonts w:ascii="Tahoma" w:cs="Tahoma" w:eastAsia="Tahoma" w:hAnsi="Tahoma"/>
           <w:rtl/>
         </w:rPr>
-        <w:t xml:space="preserve">تاکنون مروری که هم‌زمان چهار معیار زیر را با هم پوشش دهد شناسایی نشده است: (الف) مداخله دیجیتال، (ب) مکانیسم روان‌شناختی، (ج) outcome اختصاصاً فرسودگی شغلی، و (د) طراحی تصادفی‌سازی‌شده، در تمام گروه‌های شغلی (نه محدود به یک حرفه). این پروژه با سؤال زیر این خلأ را هدف قرار می‌دهد:</w:t>
+        <w:t xml:space="preserve">در جست‌وجوهای انجام‌شده برای این پروژه (بخش ۲.۳؛ به‌اضافه بازبینی سه مرور مرتبط دیگر که در بخش ۴.۴ بحث شده‌اند)، مروری که هم‌زمان چهار معیار زیر را پوشش دهد شناسایی نشده است: (الف) مداخله دیجیتال، (ب) outcome اختصاصاً فرسودگی شغلی (نه صرفاً استرس/سلامت روان عمومی)، (ج) طراحی تصادفی‌سازی‌شده، و (د) در تمام گروه‌های شغلی (نه محدود به یک حرفه). این ادعا به جست‌وجوهای انجام‌شده محدود است، نه یک بیانیه قطعی درباره کل ادبیات (بخش ۴.۴). این پروژه با سؤال زیر این خلأ را هدف قرار می‌دهد:</w:t>
       </w:r>
     </w:p>
     <w:p>
@@ -566,7 +566,7 @@
           <w:rFonts w:ascii="Tahoma" w:cs="Tahoma" w:eastAsia="Tahoma" w:hAnsi="Tahoma"/>
           <w:rtl/>
         </w:rPr>
-        <w:t xml:space="preserve">چارچوب جمعیت-مفهوم-بستر (Population-Concept-Context) این سؤال به شرح زیر است: جمعیت = شاغلین در هر حرفه (نه دانشجو یا بیمار)؛ مفهوم = مداخله دیجیتال با مکانیسم روان‌شناختی که فرسودگی شغلی را هدف/اندازه‌گیری می‌کند؛ بستر = کارآزمایی‌های تصادفی‌سازی‌شده (فردی، خوشه‌ای، متقاطع یا stepped-wedge)، بدون محدودیت زمانی یا جغرافیایی.</w:t>
+        <w:t xml:space="preserve">چارچوب جمعیت-مفهوم-بستر (Population-Concept-Context) این سؤال به شرح زیر است: جمعیت = شاغلین در هر حرفه (نه دانشجو یا بیمار)؛ مفهوم = مداخله دیجیتال در این جمعیت که فرسودگی شغلی را به‌عنوان outcome (اصلی یا ثانویه) هدف/اندازه‌گیری می‌کند، صرف‌نظر از این‌که مکانیسم اصلی آن کلاسیک روان‌شناختی باشد یا نه (عملیاتی‌سازی صریح و دلیل این انتخاب در بخش ۲.۲)؛ بستر = کارآزمایی‌های تصادفی‌سازی‌شده (فردی، خوشه‌ای، متقاطع یا stepped-wedge)، بدون محدودیت زمانی یا جغرافیایی.</w:t>
       </w:r>
     </w:p>
     <w:p>
@@ -5511,7 +5511,7 @@
           <w:rFonts w:ascii="Tahoma" w:cs="Tahoma" w:eastAsia="Tahoma" w:hAnsi="Tahoma"/>
           <w:rtl/>
         </w:rPr>
-        <w:t xml:space="preserve">این مرور دامنه‌ای نشان داد میدان کارآزمایی‌های تصادفی‌سازی‌شده مداخلات روان‌شناختی دیجیتال برای فرسودگی شغلی به‌سرعت (عمدتاً پس از ۲۰۲۱) در حال رشد است، اما به‌شدت حول جمعیت‌های نظام سلامت متمرکز مانده. رویکردهای روان‌شناختی از CBT/ذهن‌آگاهی کلاسیک به سمت خودشفقت‌ورزی و رویکردهای مبتنی بر پذیرش گسترش یافته‌اند، هم‌زمان با ورود فناوری‌های نوظهور (VR، هوش مصنوعی) که هنوز عمدتاً با رویکردهای کلاسیک ترکیب شده‌اند تا رویکردهای جدیدتر.</w:t>
+        <w:t xml:space="preserve">این مرور دامنه‌ای نشان داد میدان کارآزمایی‌های تصادفی‌سازی‌شده مداخلات دیجیتال با گزارش پیامد فرسودگی شغلی به‌سرعت (عمدتاً پس از ۲۰۲۱) در حال رشد است، اما به‌شدت حول جمعیت‌های نظام سلامت متمرکز مانده. اکثریت قاطع این مداخلات (۱۴۱ از ۱۴۵ گزارش) مکانیسم کلاسیک روان‌شناختی دارند؛ رویکردهای روان‌شناختی از CBT/ذهن‌آگاهی کلاسیک به سمت خودشفقت‌ورزی و رویکردهای مبتنی بر پذیرش گسترش یافته‌اند، هم‌زمان با ورود فناوری‌های نوظهور (VR، هوش مصنوعی) که هنوز عمدتاً با رویکردهای کلاسیک ترکیب شده‌اند تا رویکردهای جدیدتر. ۴ مورد مرزی hybrid/غیر-کلاسیک-روان‌شناختی (بخش ۴.۳) طبق معیار ورود گسترده نگه داشته شدند.</w:t>
       </w:r>
     </w:p>
     <w:p>

</xml_diff>